<commit_message>
Invoice 2026-03: Salmon Oshizushi qty 1 → 2
Missed second block on the original invoice. Total payable
$257.47 → $266.96.

Co-Authored-By: Claude Opus 4.7 (1M context) <noreply@anthropic.com>
</commit_message>
<xml_diff>
--- a/Janine's Gardens invoice 2026-03 - Sweet Ofelia.docx
+++ b/Janine's Gardens invoice 2026-03 - Sweet Ofelia.docx
@@ -1729,7 +1729,7 @@
                 <w:szCs w:val="24"/>
                 <w:lang w:val="en-US"/>
               </w:rPr>
-              <w:t>1</w:t>
+              <w:t>2</w:t>
             </w:r>
           </w:p>
         </w:tc>
@@ -1779,7 +1779,7 @@
                 <w:szCs w:val="24"/>
                 <w:lang w:val="en-US"/>
               </w:rPr>
-              <w:t>12.00</w:t>
+              <w:t>24.00</w:t>
             </w:r>
           </w:p>
         </w:tc>
@@ -1892,7 +1892,7 @@
                 <w:szCs w:val="24"/>
                 <w:lang w:val="en-US"/>
               </w:rPr>
-              <w:t>325.50</w:t>
+              <w:t>337.50</w:t>
             </w:r>
           </w:p>
         </w:tc>
@@ -1975,7 +1975,7 @@
                 <w:szCs w:val="24"/>
                 <w:lang w:val="en-US"/>
               </w:rPr>
-              <w:t>−97.65</w:t>
+              <w:t>−101.25</w:t>
             </w:r>
           </w:p>
         </w:tc>
@@ -2062,7 +2062,7 @@
                 <w:szCs w:val="24"/>
                 <w:lang w:val="en-US"/>
               </w:rPr>
-              <w:t>227.85</w:t>
+              <w:t>236.25</w:t>
             </w:r>
           </w:p>
         </w:tc>
@@ -2145,7 +2145,7 @@
                 <w:szCs w:val="24"/>
                 <w:lang w:val="en-US"/>
               </w:rPr>
-              <w:t>29.62</w:t>
+              <w:t>30.71</w:t>
             </w:r>
           </w:p>
         </w:tc>
@@ -2236,7 +2236,7 @@
                 <w:szCs w:val="24"/>
                 <w:lang w:val="en-US"/>
               </w:rPr>
-              <w:t>257.47</w:t>
+              <w:t>266.96</w:t>
             </w:r>
           </w:p>
         </w:tc>

</xml_diff>